<commit_message>
Conform the manuscript to the journal's article outline
</commit_message>
<xml_diff>
--- a/docs/preprint/supplementary.docx
+++ b/docs/preprint/supplementary.docx
@@ -54,13 +54,6 @@
       </w:pPr>
       <w:r>
         <w:t xml:space="preserve">Md Omar Faruqe and Md Humayun Kabir</w:t>
-      </w:r>
-    </w:p>
-    <w:p>
-      <w:r>
-        <w:pict>
-          <v:rect style="width:0;height:1.5pt" o:hralign="center" o:hrstd="t" o:hr="t"/>
-        </w:pict>
       </w:r>
     </w:p>
     <w:p>

</xml_diff>